<commit_message>
Taller: aprendizaje del audio de los clips en las notas; Sistema Avatar Ads 1.5.4 (revisar la estática de cada clip)
Co-Authored-By: Claude Opus 5.5 <noreply@anthropic.com>
</commit_message>
<xml_diff>
--- a/programa/taller-01-apertura/notas-taller.docx
+++ b/programa/taller-01-apertura/notas-taller.docx
@@ -2794,6 +2794,75 @@
           <w:rtl w:val="0"/>
         </w:rPr>
         <w:t xml:space="preserve">Omni 1.1 para generar los videos.</w:t>
+      </w:r>
+    </w:p>
+    <w:p>
+      <w:pPr>
+        <w:rPr>
+          <w:b w:val="1"/>
+          <w:bCs w:val="1"/>
+        </w:rPr>
+      </w:pPr>
+    </w:p>
+    <w:p>
+      <w:pPr>
+        <w:rPr>
+          <w:b w:val="1"/>
+          <w:bCs w:val="1"/>
+        </w:rPr>
+      </w:pPr>
+      <w:r>
+        <w:rPr>
+          <w:b w:val="1"/>
+          <w:bCs w:val="1"/>
+          <w:rtl w:val="0"/>
+        </w:rPr>
+        <w:t xml:space="preserve">AL GENERAR LOS CLIPS: ESCUCHA EL AUDIO</w:t>
+      </w:r>
+    </w:p>
+    <w:p>
+      <w:pPr>
+        <w:numPr>
+          <w:ilvl w:val="0"/>
+          <w:numId w:val="6"/>
+        </w:numPr>
+        <w:ind w:left="720" w:hanging="360"/>
+      </w:pPr>
+      <w:r>
+        <w:rPr>
+          <w:rtl w:val="0"/>
+        </w:rPr>
+        <w:t xml:space="preserve">Cada vez que generamos un clip, hay que escuchar bien el audio y asegurarnos de que todos los clips suenen igual, sin estática ni ruido de fondo.</w:t>
+      </w:r>
+    </w:p>
+    <w:p>
+      <w:pPr>
+        <w:numPr>
+          <w:ilvl w:val="0"/>
+          <w:numId w:val="6"/>
+        </w:numPr>
+        <w:ind w:left="720" w:hanging="360"/>
+      </w:pPr>
+      <w:r>
+        <w:rPr>
+          <w:rtl w:val="0"/>
+        </w:rPr>
+        <w:t xml:space="preserve">Si un clip no tiene buen audio, se regenera (solo ese clip).</w:t>
+      </w:r>
+    </w:p>
+    <w:p>
+      <w:pPr>
+        <w:numPr>
+          <w:ilvl w:val="0"/>
+          <w:numId w:val="6"/>
+        </w:numPr>
+        <w:ind w:left="720" w:hanging="360"/>
+      </w:pPr>
+      <w:r>
+        <w:rPr>
+          <w:rtl w:val="0"/>
+        </w:rPr>
+        <w:t xml:space="preserve">No es que siempre haya que estar regenerando: en el 80% de los casos el audio sale bien. Ejemplo real: de los 6 clips del anuncio del café, los 5 primeros salieron bien y solo el último tuve que generarlo de nuevo.</w:t>
       </w:r>
     </w:p>
     <w:sectPr>

</xml_diff>

<commit_message>
Taller: notas con la explicación de 720p (varias cuentas) vs 1080p (plan de pago)
Co-Authored-By: Claude Opus 5.5 <noreply@anthropic.com>
</commit_message>
<xml_diff>
--- a/programa/taller-01-apertura/notas-taller.docx
+++ b/programa/taller-01-apertura/notas-taller.docx
@@ -779,6 +779,51 @@
           <w:rtl w:val="0"/>
         </w:rPr>
         <w:t xml:space="preserve">Opción B: Puedes tener varias cuentas de gmail (+5). Cada cuenta te da 50 créditos al día. Con 10 cuentas tienes 500 créditos de generación. </w:t>
+      </w:r>
+    </w:p>
+    <w:p>
+      <w:pPr>
+        <w:numPr>
+          <w:ilvl w:val="2"/>
+          <w:numId w:val="3"/>
+        </w:numPr>
+        <w:ind w:left="2160" w:hanging="360"/>
+      </w:pPr>
+      <w:r>
+        <w:rPr>
+          <w:rtl w:val="0"/>
+        </w:rPr>
+        <w:t xml:space="preserve">Con la opción B, los videos se descargan en 720p. Yo uso 5 cuentas de Gmail (unos 250 créditos al día) y no he tenido ningún problema ni bloqueo de Google.</w:t>
+      </w:r>
+    </w:p>
+    <w:p>
+      <w:pPr>
+        <w:numPr>
+          <w:ilvl w:val="2"/>
+          <w:numId w:val="3"/>
+        </w:numPr>
+        <w:ind w:left="2160" w:hanging="360"/>
+      </w:pPr>
+      <w:r>
+        <w:rPr>
+          <w:rtl w:val="0"/>
+        </w:rPr>
+        <w:t xml:space="preserve">720p no es mala resolución: el sistema de edición le hace un pequeño upscale al exportar el anuncio, y cuando lo subes a Meta, Meta lo comprime igual.</w:t>
+      </w:r>
+    </w:p>
+    <w:p>
+      <w:pPr>
+        <w:numPr>
+          <w:ilvl w:val="2"/>
+          <w:numId w:val="3"/>
+        </w:numPr>
+        <w:ind w:left="2160" w:hanging="360"/>
+      </w:pPr>
+      <w:r>
+        <w:rPr>
+          <w:rtl w:val="0"/>
+        </w:rPr>
+        <w:t xml:space="preserve">Si tienes la cuenta de pago (opción A, 1000 créditos), puedes descargar los videos en 1080p.</w:t>
       </w:r>
     </w:p>
     <w:p>

</xml_diff>

<commit_message>
Taller: notas con la voz en off (Google AI Studio)
Co-Authored-By: Claude Opus 5.5 <noreply@anthropic.com>
</commit_message>
<xml_diff>
--- a/programa/taller-01-apertura/notas-taller.docx
+++ b/programa/taller-01-apertura/notas-taller.docx
@@ -824,6 +824,21 @@
           <w:rtl w:val="0"/>
         </w:rPr>
         <w:t xml:space="preserve">Si tienes la cuenta de pago (opción A, 1000 créditos), puedes descargar los videos en 1080p.</w:t>
+      </w:r>
+    </w:p>
+    <w:p>
+      <w:pPr>
+        <w:numPr>
+          <w:ilvl w:val="0"/>
+          <w:numId w:val="3"/>
+        </w:numPr>
+        <w:ind w:left="720" w:hanging="360"/>
+      </w:pPr>
+      <w:r>
+        <w:rPr>
+          <w:rtl w:val="0"/>
+        </w:rPr>
+        <w:t xml:space="preserve">Google AI Studio (gratis). Aquí generamos la voz en off.</w:t>
       </w:r>
     </w:p>
     <w:p>
@@ -2908,6 +2923,75 @@
           <w:rtl w:val="0"/>
         </w:rPr>
         <w:t xml:space="preserve">No es que siempre haya que estar regenerando: en el 80% de los casos el audio sale bien. Ejemplo real: de los 6 clips del anuncio del café, los 5 primeros salieron bien y solo el último tuve que generarlo de nuevo.</w:t>
+      </w:r>
+    </w:p>
+    <w:p>
+      <w:pPr>
+        <w:rPr>
+          <w:b w:val="1"/>
+          <w:bCs w:val="1"/>
+        </w:rPr>
+      </w:pPr>
+    </w:p>
+    <w:p>
+      <w:pPr>
+        <w:rPr>
+          <w:b w:val="1"/>
+          <w:bCs w:val="1"/>
+        </w:rPr>
+      </w:pPr>
+      <w:r>
+        <w:rPr>
+          <w:b w:val="1"/>
+          <w:bCs w:val="1"/>
+          <w:rtl w:val="0"/>
+        </w:rPr>
+        <w:t xml:space="preserve">VOZ EN OFF</w:t>
+      </w:r>
+    </w:p>
+    <w:p>
+      <w:pPr>
+        <w:numPr>
+          <w:ilvl w:val="0"/>
+          <w:numId w:val="6"/>
+        </w:numPr>
+        <w:ind w:left="720" w:hanging="360"/>
+      </w:pPr>
+      <w:r>
+        <w:rPr>
+          <w:rtl w:val="0"/>
+        </w:rPr>
+        <w:t xml:space="preserve">La voz en off la generamos en Google AI Studio, gratis.</w:t>
+      </w:r>
+    </w:p>
+    <w:p>
+      <w:pPr>
+        <w:numPr>
+          <w:ilvl w:val="0"/>
+          <w:numId w:val="6"/>
+        </w:numPr>
+        <w:ind w:left="720" w:hanging="360"/>
+      </w:pPr>
+      <w:r>
+        <w:rPr>
+          <w:rtl w:val="0"/>
+        </w:rPr>
+        <w:t xml:space="preserve">La clave: que suene a una persona contándole algo a un amigo, no a un locutor ni a un comercial.</w:t>
+      </w:r>
+    </w:p>
+    <w:p>
+      <w:pPr>
+        <w:numPr>
+          <w:ilvl w:val="0"/>
+          <w:numId w:val="6"/>
+        </w:numPr>
+        <w:ind w:left="720" w:hanging="360"/>
+      </w:pPr>
+      <w:r>
+        <w:rPr>
+          <w:rtl w:val="0"/>
+        </w:rPr>
+        <w:t xml:space="preserve">El sistema te da todo listo para copiar y pegar.</w:t>
       </w:r>
     </w:p>
     <w:sectPr>

</xml_diff>